<commit_message>
updated reflection document with screenshots
</commit_message>
<xml_diff>
--- a/reflection_document.docx
+++ b/reflection_document.docx
@@ -9,6 +9,9 @@
     </w:p>
     <w:p>
       <w:r>
+        <w:rPr>
+          <w:noProof/>
+        </w:rPr>
         <w:drawing>
           <wp:inline distT="0" distB="0" distL="0" distR="0" wp14:anchorId="27D97233" wp14:editId="024EA49C">
             <wp:extent cx="2724977" cy="3752510"/>
@@ -49,6 +52,9 @@
         <w:t xml:space="preserve">    </w:t>
       </w:r>
       <w:r>
+        <w:rPr>
+          <w:noProof/>
+        </w:rPr>
         <w:drawing>
           <wp:inline distT="0" distB="0" distL="0" distR="0" wp14:anchorId="17A5DB4D" wp14:editId="2113A18E">
             <wp:extent cx="2590800" cy="3731986"/>
@@ -93,6 +99,9 @@
     </w:p>
     <w:p>
       <w:r>
+        <w:rPr>
+          <w:noProof/>
+        </w:rPr>
         <w:drawing>
           <wp:inline distT="0" distB="0" distL="0" distR="0" wp14:anchorId="638227F0" wp14:editId="6C3C5C4A">
             <wp:extent cx="5943600" cy="2791460"/>
@@ -140,6 +149,9 @@
     </w:p>
     <w:p>
       <w:r>
+        <w:rPr>
+          <w:noProof/>
+        </w:rPr>
         <w:drawing>
           <wp:inline distT="0" distB="0" distL="0" distR="0" wp14:anchorId="00C1079B" wp14:editId="562C84AD">
             <wp:extent cx="4912818" cy="3429000"/>
@@ -179,6 +191,9 @@
     </w:p>
     <w:p>
       <w:r>
+        <w:rPr>
+          <w:noProof/>
+        </w:rPr>
         <w:drawing>
           <wp:inline distT="0" distB="0" distL="0" distR="0" wp14:anchorId="5BA97F14" wp14:editId="3CAD2774">
             <wp:extent cx="4486675" cy="3490595"/>
@@ -231,6 +246,9 @@
     </w:p>
     <w:p>
       <w:r>
+        <w:rPr>
+          <w:noProof/>
+        </w:rPr>
         <w:drawing>
           <wp:inline distT="0" distB="0" distL="0" distR="0" wp14:anchorId="512C26DC" wp14:editId="29D6B02D">
             <wp:extent cx="4933950" cy="2335719"/>
@@ -275,6 +293,9 @@
     </w:p>
     <w:p>
       <w:r>
+        <w:rPr>
+          <w:noProof/>
+        </w:rPr>
         <w:drawing>
           <wp:inline distT="0" distB="0" distL="0" distR="0" wp14:anchorId="78948035" wp14:editId="4783B82C">
             <wp:extent cx="5121072" cy="2431415"/>
@@ -324,11 +345,14 @@
     </w:p>
     <w:p>
       <w:r>
+        <w:rPr>
+          <w:noProof/>
+        </w:rPr>
         <w:drawing>
-          <wp:inline distT="0" distB="0" distL="0" distR="0" wp14:anchorId="38D988DA" wp14:editId="1BA8914C">
-            <wp:extent cx="5943600" cy="1081405"/>
-            <wp:effectExtent l="0" t="0" r="0" b="4445"/>
-            <wp:docPr id="371446678" name="Picture 1"/>
+          <wp:inline distT="0" distB="0" distL="0" distR="0" wp14:anchorId="60C7EED8" wp14:editId="3DA5C439">
+            <wp:extent cx="5943600" cy="1306195"/>
+            <wp:effectExtent l="0" t="0" r="0" b="8255"/>
+            <wp:docPr id="1979319937" name="Picture 1"/>
             <wp:cNvGraphicFramePr>
               <a:graphicFrameLocks xmlns:a="http://schemas.openxmlformats.org/drawingml/2006/main" noChangeAspect="1"/>
             </wp:cNvGraphicFramePr>
@@ -336,7 +360,7 @@
               <a:graphicData uri="http://schemas.openxmlformats.org/drawingml/2006/picture">
                 <pic:pic xmlns:pic="http://schemas.openxmlformats.org/drawingml/2006/picture">
                   <pic:nvPicPr>
-                    <pic:cNvPr id="371446678" name=""/>
+                    <pic:cNvPr id="1979319937" name=""/>
                     <pic:cNvPicPr/>
                   </pic:nvPicPr>
                   <pic:blipFill>
@@ -348,7 +372,7 @@
                   <pic:spPr>
                     <a:xfrm>
                       <a:off x="0" y="0"/>
-                      <a:ext cx="5943600" cy="1081405"/>
+                      <a:ext cx="5943600" cy="1306195"/>
                     </a:xfrm>
                     <a:prstGeom prst="rect">
                       <a:avLst/>
@@ -365,17 +389,19 @@
     <w:p/>
     <w:p>
       <w:r>
-        <w:lastRenderedPageBreak/>
         <w:t>Docker:</w:t>
       </w:r>
     </w:p>
     <w:p>
       <w:r>
+        <w:rPr>
+          <w:noProof/>
+        </w:rPr>
         <w:drawing>
-          <wp:inline distT="0" distB="0" distL="0" distR="0" wp14:anchorId="2D7FC906" wp14:editId="603AED09">
-            <wp:extent cx="5943600" cy="955040"/>
+          <wp:inline distT="0" distB="0" distL="0" distR="0" wp14:anchorId="5CACDB01" wp14:editId="479CF4AF">
+            <wp:extent cx="5943600" cy="941070"/>
             <wp:effectExtent l="0" t="0" r="0" b="0"/>
-            <wp:docPr id="1720299076" name="Picture 1"/>
+            <wp:docPr id="1821254288" name="Picture 1"/>
             <wp:cNvGraphicFramePr>
               <a:graphicFrameLocks xmlns:a="http://schemas.openxmlformats.org/drawingml/2006/main" noChangeAspect="1"/>
             </wp:cNvGraphicFramePr>
@@ -383,7 +409,7 @@
               <a:graphicData uri="http://schemas.openxmlformats.org/drawingml/2006/picture">
                 <pic:pic xmlns:pic="http://schemas.openxmlformats.org/drawingml/2006/picture">
                   <pic:nvPicPr>
-                    <pic:cNvPr id="1720299076" name=""/>
+                    <pic:cNvPr id="1821254288" name=""/>
                     <pic:cNvPicPr/>
                   </pic:nvPicPr>
                   <pic:blipFill>
@@ -395,7 +421,7 @@
                   <pic:spPr>
                     <a:xfrm>
                       <a:off x="0" y="0"/>
-                      <a:ext cx="5943600" cy="955040"/>
+                      <a:ext cx="5943600" cy="941070"/>
                     </a:xfrm>
                     <a:prstGeom prst="rect">
                       <a:avLst/>
@@ -408,6 +434,103 @@
         </w:drawing>
       </w:r>
     </w:p>
+    <w:p/>
+    <w:p>
+      <w:r>
+        <w:t>Updated</w:t>
+      </w:r>
+      <w:r>
+        <w:t xml:space="preserve"> with new operators</w:t>
+      </w:r>
+      <w:r>
+        <w:t>:</w:t>
+      </w:r>
+    </w:p>
+    <w:p>
+      <w:r>
+        <w:drawing>
+          <wp:inline distT="0" distB="0" distL="0" distR="0" wp14:anchorId="3527AFDD" wp14:editId="2C1E923A">
+            <wp:extent cx="5943600" cy="2921635"/>
+            <wp:effectExtent l="0" t="0" r="0" b="0"/>
+            <wp:docPr id="1977756126" name="Picture 1"/>
+            <wp:cNvGraphicFramePr>
+              <a:graphicFrameLocks xmlns:a="http://schemas.openxmlformats.org/drawingml/2006/main" noChangeAspect="1"/>
+            </wp:cNvGraphicFramePr>
+            <a:graphic xmlns:a="http://schemas.openxmlformats.org/drawingml/2006/main">
+              <a:graphicData uri="http://schemas.openxmlformats.org/drawingml/2006/picture">
+                <pic:pic xmlns:pic="http://schemas.openxmlformats.org/drawingml/2006/picture">
+                  <pic:nvPicPr>
+                    <pic:cNvPr id="1977756126" name=""/>
+                    <pic:cNvPicPr/>
+                  </pic:nvPicPr>
+                  <pic:blipFill>
+                    <a:blip r:embed="rId13"/>
+                    <a:stretch>
+                      <a:fillRect/>
+                    </a:stretch>
+                  </pic:blipFill>
+                  <pic:spPr>
+                    <a:xfrm>
+                      <a:off x="0" y="0"/>
+                      <a:ext cx="5943600" cy="2921635"/>
+                    </a:xfrm>
+                    <a:prstGeom prst="rect">
+                      <a:avLst/>
+                    </a:prstGeom>
+                  </pic:spPr>
+                </pic:pic>
+              </a:graphicData>
+            </a:graphic>
+          </wp:inline>
+        </w:drawing>
+      </w:r>
+    </w:p>
+    <w:p>
+      <w:r>
+        <w:lastRenderedPageBreak/>
+        <w:drawing>
+          <wp:inline distT="0" distB="0" distL="0" distR="0" wp14:anchorId="1A12C5C3" wp14:editId="0467A98E">
+            <wp:extent cx="5943600" cy="3854450"/>
+            <wp:effectExtent l="0" t="0" r="0" b="0"/>
+            <wp:docPr id="881124238" name="Picture 1"/>
+            <wp:cNvGraphicFramePr>
+              <a:graphicFrameLocks xmlns:a="http://schemas.openxmlformats.org/drawingml/2006/main" noChangeAspect="1"/>
+            </wp:cNvGraphicFramePr>
+            <a:graphic xmlns:a="http://schemas.openxmlformats.org/drawingml/2006/main">
+              <a:graphicData uri="http://schemas.openxmlformats.org/drawingml/2006/picture">
+                <pic:pic xmlns:pic="http://schemas.openxmlformats.org/drawingml/2006/picture">
+                  <pic:nvPicPr>
+                    <pic:cNvPr id="881124238" name=""/>
+                    <pic:cNvPicPr/>
+                  </pic:nvPicPr>
+                  <pic:blipFill>
+                    <a:blip r:embed="rId14"/>
+                    <a:stretch>
+                      <a:fillRect/>
+                    </a:stretch>
+                  </pic:blipFill>
+                  <pic:spPr>
+                    <a:xfrm>
+                      <a:off x="0" y="0"/>
+                      <a:ext cx="5943600" cy="3854450"/>
+                    </a:xfrm>
+                    <a:prstGeom prst="rect">
+                      <a:avLst/>
+                    </a:prstGeom>
+                  </pic:spPr>
+                </pic:pic>
+              </a:graphicData>
+            </a:graphic>
+          </wp:inline>
+        </w:drawing>
+      </w:r>
+      <w:r>
+        <w:br/>
+      </w:r>
+      <w:r>
+        <w:br/>
+      </w:r>
+    </w:p>
     <w:p>
       <w:r>
         <w:t>Reflection:</w:t>
@@ -415,13 +538,18 @@
     </w:p>
     <w:p>
       <w:r>
-        <w:t xml:space="preserve">I was able to learn a lot about the docker program and get reacquainted with my front-end and back-end programming skills. I was able to </w:t>
-      </w:r>
-      <w:r>
-        <w:t>look at the code and see that the testing parts were working before adding some code to test the bread application. A lot of the things that I did for the previous modules made this easier to compile and run correctly. I was able to do a lot of the testing locally on localhost for checking the application to see if everything was working properly which it was. The hardest part was probably taking everything I’ve learned and applying it to the current module before starting on the final project.</w:t>
-      </w:r>
-    </w:p>
-    <w:p/>
+        <w:t>The final project helped bring everything together from the past few weeks. Understanding each part of the process in each file allowed me to add the modulus and exponential functions to the program.</w:t>
+      </w:r>
+      <w:r>
+        <w:t xml:space="preserve"> By understanding the whole process along with the debugging and docker systems, I was able to fully run everything together to make it work.</w:t>
+      </w:r>
+      <w:r>
+        <w:t xml:space="preserve"> Understanding the different sections as well as being able to write some tests based off of the other mathematical operations gave me a lot of insight how to further improve my </w:t>
+      </w:r>
+      <w:r>
+        <w:t>own thought process when it comes to creating apps like this.</w:t>
+      </w:r>
+    </w:p>
     <w:sectPr>
       <w:pgSz w:w="12240" w:h="15840"/>
       <w:pgMar w:top="1440" w:right="1440" w:bottom="1440" w:left="1440" w:header="720" w:footer="720" w:gutter="0"/>

</xml_diff>